<commit_message>
Add scanned handwritten calculations to Appendix A
Nine sheets, three per member, embedded after each member's summary.

Co-Authored-By: Claude Opus 5.5 <noreply@anthropic.com>
</commit_message>
<xml_diff>
--- a/i222429_i222595_i228780_A1.docx
+++ b/i222429_i222595_i228780_A1.docx
@@ -585,7 +585,7 @@
         </w:rPr>
         <w:fldChar w:fldCharType="separate"/>
       </w:r>
-      <w:hyperlink w:anchor="_Toc242517007" w:history="1">
+      <w:hyperlink w:anchor="_Toc242518804" w:history="1">
         <w:r>
           <w:rPr>
             <w:rStyle w:val="Hyperlink"/>
@@ -616,7 +616,7 @@
             <w:webHidden/>
             <w:sz w:val="20"/>
           </w:rPr>
-          <w:instrText xml:space="preserve"> PAGEREF _Toc242517007 \h </w:instrText>
+          <w:instrText xml:space="preserve"> PAGEREF _Toc242518804 \h </w:instrText>
         </w:r>
         <w:r>
           <w:rPr>
@@ -663,7 +663,7 @@
           <w:sz w:val="20"/>
         </w:rPr>
       </w:pPr>
-      <w:hyperlink w:anchor="_Toc242517008" w:history="1">
+      <w:hyperlink w:anchor="_Toc242518805" w:history="1">
         <w:r>
           <w:rPr>
             <w:rStyle w:val="Hyperlink"/>
@@ -694,7 +694,7 @@
             <w:webHidden/>
             <w:sz w:val="20"/>
           </w:rPr>
-          <w:instrText xml:space="preserve"> PAGEREF _Toc242517008 \h </w:instrText>
+          <w:instrText xml:space="preserve"> PAGEREF _Toc242518805 \h </w:instrText>
         </w:r>
         <w:r>
           <w:rPr>
@@ -741,7 +741,7 @@
           <w:sz w:val="20"/>
         </w:rPr>
       </w:pPr>
-      <w:hyperlink w:anchor="_Toc242517009" w:history="1">
+      <w:hyperlink w:anchor="_Toc242518806" w:history="1">
         <w:r>
           <w:rPr>
             <w:rStyle w:val="Hyperlink"/>
@@ -772,7 +772,7 @@
             <w:webHidden/>
             <w:sz w:val="20"/>
           </w:rPr>
-          <w:instrText xml:space="preserve"> PAGEREF _Toc242517009 \h </w:instrText>
+          <w:instrText xml:space="preserve"> PAGEREF _Toc242518806 \h </w:instrText>
         </w:r>
         <w:r>
           <w:rPr>
@@ -819,7 +819,7 @@
           <w:sz w:val="20"/>
         </w:rPr>
       </w:pPr>
-      <w:hyperlink w:anchor="_Toc242517010" w:history="1">
+      <w:hyperlink w:anchor="_Toc242518807" w:history="1">
         <w:r>
           <w:rPr>
             <w:rStyle w:val="Hyperlink"/>
@@ -850,7 +850,7 @@
             <w:webHidden/>
             <w:sz w:val="20"/>
           </w:rPr>
-          <w:instrText xml:space="preserve"> PAGEREF _Toc242517010 \h </w:instrText>
+          <w:instrText xml:space="preserve"> PAGEREF _Toc242518807 \h </w:instrText>
         </w:r>
         <w:r>
           <w:rPr>
@@ -897,7 +897,7 @@
           <w:sz w:val="20"/>
         </w:rPr>
       </w:pPr>
-      <w:hyperlink w:anchor="_Toc242517011" w:history="1">
+      <w:hyperlink w:anchor="_Toc242518808" w:history="1">
         <w:r>
           <w:rPr>
             <w:rStyle w:val="Hyperlink"/>
@@ -928,7 +928,7 @@
             <w:webHidden/>
             <w:sz w:val="20"/>
           </w:rPr>
-          <w:instrText xml:space="preserve"> PAGEREF _Toc242517011 \h </w:instrText>
+          <w:instrText xml:space="preserve"> PAGEREF _Toc242518808 \h </w:instrText>
         </w:r>
         <w:r>
           <w:rPr>
@@ -975,7 +975,7 @@
           <w:sz w:val="20"/>
         </w:rPr>
       </w:pPr>
-      <w:hyperlink w:anchor="_Toc242517012" w:history="1">
+      <w:hyperlink w:anchor="_Toc242518809" w:history="1">
         <w:r>
           <w:rPr>
             <w:rStyle w:val="Hyperlink"/>
@@ -1006,7 +1006,7 @@
             <w:webHidden/>
             <w:sz w:val="20"/>
           </w:rPr>
-          <w:instrText xml:space="preserve"> PAGEREF _Toc242517012 \h </w:instrText>
+          <w:instrText xml:space="preserve"> PAGEREF _Toc242518809 \h </w:instrText>
         </w:r>
         <w:r>
           <w:rPr>
@@ -1053,7 +1053,7 @@
           <w:sz w:val="20"/>
         </w:rPr>
       </w:pPr>
-      <w:hyperlink w:anchor="_Toc242517013" w:history="1">
+      <w:hyperlink w:anchor="_Toc242518810" w:history="1">
         <w:r>
           <w:rPr>
             <w:rStyle w:val="Hyperlink"/>
@@ -1084,7 +1084,7 @@
             <w:webHidden/>
             <w:sz w:val="20"/>
           </w:rPr>
-          <w:instrText xml:space="preserve"> PAGEREF _Toc242517013 \h </w:instrText>
+          <w:instrText xml:space="preserve"> PAGEREF _Toc242518810 \h </w:instrText>
         </w:r>
         <w:r>
           <w:rPr>
@@ -1131,7 +1131,7 @@
           <w:sz w:val="20"/>
         </w:rPr>
       </w:pPr>
-      <w:hyperlink w:anchor="_Toc242517014" w:history="1">
+      <w:hyperlink w:anchor="_Toc242518811" w:history="1">
         <w:r>
           <w:rPr>
             <w:rStyle w:val="Hyperlink"/>
@@ -1162,7 +1162,7 @@
             <w:webHidden/>
             <w:sz w:val="20"/>
           </w:rPr>
-          <w:instrText xml:space="preserve"> PAGEREF _Toc242517014 \h </w:instrText>
+          <w:instrText xml:space="preserve"> PAGEREF _Toc242518811 \h </w:instrText>
         </w:r>
         <w:r>
           <w:rPr>
@@ -1209,7 +1209,7 @@
           <w:sz w:val="20"/>
         </w:rPr>
       </w:pPr>
-      <w:hyperlink w:anchor="_Toc242517015" w:history="1">
+      <w:hyperlink w:anchor="_Toc242518812" w:history="1">
         <w:r>
           <w:rPr>
             <w:rStyle w:val="Hyperlink"/>
@@ -1240,7 +1240,7 @@
             <w:webHidden/>
             <w:sz w:val="20"/>
           </w:rPr>
-          <w:instrText xml:space="preserve"> PAGEREF _Toc242517015 \h </w:instrText>
+          <w:instrText xml:space="preserve"> PAGEREF _Toc242518812 \h </w:instrText>
         </w:r>
         <w:r>
           <w:rPr>
@@ -1287,7 +1287,7 @@
           <w:sz w:val="20"/>
         </w:rPr>
       </w:pPr>
-      <w:hyperlink w:anchor="_Toc242517016" w:history="1">
+      <w:hyperlink w:anchor="_Toc242518813" w:history="1">
         <w:r>
           <w:rPr>
             <w:rStyle w:val="Hyperlink"/>
@@ -1318,7 +1318,7 @@
             <w:webHidden/>
             <w:sz w:val="20"/>
           </w:rPr>
-          <w:instrText xml:space="preserve"> PAGEREF _Toc242517016 \h </w:instrText>
+          <w:instrText xml:space="preserve"> PAGEREF _Toc242518813 \h </w:instrText>
         </w:r>
         <w:r>
           <w:rPr>
@@ -1365,7 +1365,7 @@
           <w:sz w:val="20"/>
         </w:rPr>
       </w:pPr>
-      <w:hyperlink w:anchor="_Toc242517017" w:history="1">
+      <w:hyperlink w:anchor="_Toc242518814" w:history="1">
         <w:r>
           <w:rPr>
             <w:rStyle w:val="Hyperlink"/>
@@ -1396,7 +1396,7 @@
             <w:webHidden/>
             <w:sz w:val="20"/>
           </w:rPr>
-          <w:instrText xml:space="preserve"> PAGEREF _Toc242517017 \h </w:instrText>
+          <w:instrText xml:space="preserve"> PAGEREF _Toc242518814 \h </w:instrText>
         </w:r>
         <w:r>
           <w:rPr>
@@ -1443,7 +1443,7 @@
           <w:sz w:val="20"/>
         </w:rPr>
       </w:pPr>
-      <w:hyperlink w:anchor="_Toc242517018" w:history="1">
+      <w:hyperlink w:anchor="_Toc242518815" w:history="1">
         <w:r>
           <w:rPr>
             <w:rStyle w:val="Hyperlink"/>
@@ -1474,7 +1474,7 @@
             <w:webHidden/>
             <w:sz w:val="20"/>
           </w:rPr>
-          <w:instrText xml:space="preserve"> PAGEREF _Toc242517018 \h </w:instrText>
+          <w:instrText xml:space="preserve"> PAGEREF _Toc242518815 \h </w:instrText>
         </w:r>
         <w:r>
           <w:rPr>
@@ -1521,7 +1521,7 @@
           <w:sz w:val="20"/>
         </w:rPr>
       </w:pPr>
-      <w:hyperlink w:anchor="_Toc242517019" w:history="1">
+      <w:hyperlink w:anchor="_Toc242518816" w:history="1">
         <w:r>
           <w:rPr>
             <w:rStyle w:val="Hyperlink"/>
@@ -1552,7 +1552,7 @@
             <w:webHidden/>
             <w:sz w:val="20"/>
           </w:rPr>
-          <w:instrText xml:space="preserve"> PAGEREF _Toc242517019 \h </w:instrText>
+          <w:instrText xml:space="preserve"> PAGEREF _Toc242518816 \h </w:instrText>
         </w:r>
         <w:r>
           <w:rPr>
@@ -1599,7 +1599,7 @@
           <w:sz w:val="20"/>
         </w:rPr>
       </w:pPr>
-      <w:hyperlink w:anchor="_Toc242517020" w:history="1">
+      <w:hyperlink w:anchor="_Toc242518817" w:history="1">
         <w:r>
           <w:rPr>
             <w:rStyle w:val="Hyperlink"/>
@@ -1630,7 +1630,7 @@
             <w:webHidden/>
             <w:sz w:val="20"/>
           </w:rPr>
-          <w:instrText xml:space="preserve"> PAGEREF _Toc242517020 \h </w:instrText>
+          <w:instrText xml:space="preserve"> PAGEREF _Toc242518817 \h </w:instrText>
         </w:r>
         <w:r>
           <w:rPr>
@@ -1677,7 +1677,7 @@
           <w:sz w:val="20"/>
         </w:rPr>
       </w:pPr>
-      <w:hyperlink w:anchor="_Toc242517021" w:history="1">
+      <w:hyperlink w:anchor="_Toc242518818" w:history="1">
         <w:r>
           <w:rPr>
             <w:rStyle w:val="Hyperlink"/>
@@ -1708,7 +1708,7 @@
             <w:webHidden/>
             <w:sz w:val="20"/>
           </w:rPr>
-          <w:instrText xml:space="preserve"> PAGEREF _Toc242517021 \h </w:instrText>
+          <w:instrText xml:space="preserve"> PAGEREF _Toc242518818 \h </w:instrText>
         </w:r>
         <w:r>
           <w:rPr>
@@ -1755,7 +1755,7 @@
           <w:sz w:val="20"/>
         </w:rPr>
       </w:pPr>
-      <w:hyperlink w:anchor="_Toc242517022" w:history="1">
+      <w:hyperlink w:anchor="_Toc242518819" w:history="1">
         <w:r>
           <w:rPr>
             <w:rStyle w:val="Hyperlink"/>
@@ -1786,7 +1786,7 @@
             <w:webHidden/>
             <w:sz w:val="20"/>
           </w:rPr>
-          <w:instrText xml:space="preserve"> PAGEREF _Toc242517022 \h </w:instrText>
+          <w:instrText xml:space="preserve"> PAGEREF _Toc242518819 \h </w:instrText>
         </w:r>
         <w:r>
           <w:rPr>
@@ -1833,7 +1833,7 @@
           <w:sz w:val="20"/>
         </w:rPr>
       </w:pPr>
-      <w:hyperlink w:anchor="_Toc242517023" w:history="1">
+      <w:hyperlink w:anchor="_Toc242518820" w:history="1">
         <w:r>
           <w:rPr>
             <w:rStyle w:val="Hyperlink"/>
@@ -1864,7 +1864,7 @@
             <w:webHidden/>
             <w:sz w:val="20"/>
           </w:rPr>
-          <w:instrText xml:space="preserve"> PAGEREF _Toc242517023 \h </w:instrText>
+          <w:instrText xml:space="preserve"> PAGEREF _Toc242518820 \h </w:instrText>
         </w:r>
         <w:r>
           <w:rPr>
@@ -1911,7 +1911,7 @@
           <w:sz w:val="20"/>
         </w:rPr>
       </w:pPr>
-      <w:hyperlink w:anchor="_Toc242517024" w:history="1">
+      <w:hyperlink w:anchor="_Toc242518821" w:history="1">
         <w:r>
           <w:rPr>
             <w:rStyle w:val="Hyperlink"/>
@@ -1942,7 +1942,7 @@
             <w:webHidden/>
             <w:sz w:val="20"/>
           </w:rPr>
-          <w:instrText xml:space="preserve"> PAGEREF _Toc242517024 \h </w:instrText>
+          <w:instrText xml:space="preserve"> PAGEREF _Toc242518821 \h </w:instrText>
         </w:r>
         <w:r>
           <w:rPr>
@@ -1989,7 +1989,7 @@
           <w:sz w:val="20"/>
         </w:rPr>
       </w:pPr>
-      <w:hyperlink w:anchor="_Toc242517025" w:history="1">
+      <w:hyperlink w:anchor="_Toc242518822" w:history="1">
         <w:r>
           <w:rPr>
             <w:rStyle w:val="Hyperlink"/>
@@ -2020,7 +2020,7 @@
             <w:webHidden/>
             <w:sz w:val="20"/>
           </w:rPr>
-          <w:instrText xml:space="preserve"> PAGEREF _Toc242517025 \h </w:instrText>
+          <w:instrText xml:space="preserve"> PAGEREF _Toc242518822 \h </w:instrText>
         </w:r>
         <w:r>
           <w:rPr>
@@ -2067,7 +2067,7 @@
           <w:sz w:val="20"/>
         </w:rPr>
       </w:pPr>
-      <w:hyperlink w:anchor="_Toc242517026" w:history="1">
+      <w:hyperlink w:anchor="_Toc242518823" w:history="1">
         <w:r>
           <w:rPr>
             <w:rStyle w:val="Hyperlink"/>
@@ -2098,7 +2098,7 @@
             <w:webHidden/>
             <w:sz w:val="20"/>
           </w:rPr>
-          <w:instrText xml:space="preserve"> PAGEREF _Toc242517026 \h </w:instrText>
+          <w:instrText xml:space="preserve"> PAGEREF _Toc242518823 \h </w:instrText>
         </w:r>
         <w:r>
           <w:rPr>
@@ -2145,7 +2145,7 @@
           <w:sz w:val="20"/>
         </w:rPr>
       </w:pPr>
-      <w:hyperlink w:anchor="_Toc242517027" w:history="1">
+      <w:hyperlink w:anchor="_Toc242518824" w:history="1">
         <w:r>
           <w:rPr>
             <w:rStyle w:val="Hyperlink"/>
@@ -2176,7 +2176,7 @@
             <w:webHidden/>
             <w:sz w:val="20"/>
           </w:rPr>
-          <w:instrText xml:space="preserve"> PAGEREF _Toc242517027 \h </w:instrText>
+          <w:instrText xml:space="preserve"> PAGEREF _Toc242518824 \h </w:instrText>
         </w:r>
         <w:r>
           <w:rPr>
@@ -2223,7 +2223,7 @@
           <w:sz w:val="20"/>
         </w:rPr>
       </w:pPr>
-      <w:hyperlink w:anchor="_Toc242517028" w:history="1">
+      <w:hyperlink w:anchor="_Toc242518825" w:history="1">
         <w:r>
           <w:rPr>
             <w:rStyle w:val="Hyperlink"/>
@@ -2254,7 +2254,7 @@
             <w:webHidden/>
             <w:sz w:val="20"/>
           </w:rPr>
-          <w:instrText xml:space="preserve"> PAGEREF _Toc242517028 \h </w:instrText>
+          <w:instrText xml:space="preserve"> PAGEREF _Toc242518825 \h </w:instrText>
         </w:r>
         <w:r>
           <w:rPr>
@@ -2301,7 +2301,7 @@
           <w:sz w:val="20"/>
         </w:rPr>
       </w:pPr>
-      <w:hyperlink w:anchor="_Toc242517029" w:history="1">
+      <w:hyperlink w:anchor="_Toc242518826" w:history="1">
         <w:r>
           <w:rPr>
             <w:rStyle w:val="Hyperlink"/>
@@ -2332,7 +2332,7 @@
             <w:webHidden/>
             <w:sz w:val="20"/>
           </w:rPr>
-          <w:instrText xml:space="preserve"> PAGEREF _Toc242517029 \h </w:instrText>
+          <w:instrText xml:space="preserve"> PAGEREF _Toc242518826 \h </w:instrText>
         </w:r>
         <w:r>
           <w:rPr>
@@ -2379,7 +2379,7 @@
           <w:sz w:val="20"/>
         </w:rPr>
       </w:pPr>
-      <w:hyperlink w:anchor="_Toc242517030" w:history="1">
+      <w:hyperlink w:anchor="_Toc242518827" w:history="1">
         <w:r>
           <w:rPr>
             <w:rStyle w:val="Hyperlink"/>
@@ -2410,7 +2410,7 @@
             <w:webHidden/>
             <w:sz w:val="20"/>
           </w:rPr>
-          <w:instrText xml:space="preserve"> PAGEREF _Toc242517030 \h </w:instrText>
+          <w:instrText xml:space="preserve"> PAGEREF _Toc242518827 \h </w:instrText>
         </w:r>
         <w:r>
           <w:rPr>
@@ -2457,7 +2457,7 @@
           <w:sz w:val="20"/>
         </w:rPr>
       </w:pPr>
-      <w:hyperlink w:anchor="_Toc242517031" w:history="1">
+      <w:hyperlink w:anchor="_Toc242518828" w:history="1">
         <w:r>
           <w:rPr>
             <w:rStyle w:val="Hyperlink"/>
@@ -2488,7 +2488,7 @@
             <w:webHidden/>
             <w:sz w:val="20"/>
           </w:rPr>
-          <w:instrText xml:space="preserve"> PAGEREF _Toc242517031 \h </w:instrText>
+          <w:instrText xml:space="preserve"> PAGEREF _Toc242518828 \h </w:instrText>
         </w:r>
         <w:r>
           <w:rPr>
@@ -2535,7 +2535,7 @@
           <w:sz w:val="20"/>
         </w:rPr>
       </w:pPr>
-      <w:hyperlink w:anchor="_Toc242517032" w:history="1">
+      <w:hyperlink w:anchor="_Toc242518829" w:history="1">
         <w:r>
           <w:rPr>
             <w:rStyle w:val="Hyperlink"/>
@@ -2566,7 +2566,7 @@
             <w:webHidden/>
             <w:sz w:val="20"/>
           </w:rPr>
-          <w:instrText xml:space="preserve"> PAGEREF _Toc242517032 \h </w:instrText>
+          <w:instrText xml:space="preserve"> PAGEREF _Toc242518829 \h </w:instrText>
         </w:r>
         <w:r>
           <w:rPr>
@@ -2613,7 +2613,7 @@
           <w:sz w:val="20"/>
         </w:rPr>
       </w:pPr>
-      <w:hyperlink w:anchor="_Toc242517033" w:history="1">
+      <w:hyperlink w:anchor="_Toc242518830" w:history="1">
         <w:r>
           <w:rPr>
             <w:rStyle w:val="Hyperlink"/>
@@ -2644,7 +2644,7 @@
             <w:webHidden/>
             <w:sz w:val="20"/>
           </w:rPr>
-          <w:instrText xml:space="preserve"> PAGEREF _Toc242517033 \h </w:instrText>
+          <w:instrText xml:space="preserve"> PAGEREF _Toc242518830 \h </w:instrText>
         </w:r>
         <w:r>
           <w:rPr>
@@ -2691,7 +2691,7 @@
           <w:sz w:val="20"/>
         </w:rPr>
       </w:pPr>
-      <w:hyperlink w:anchor="_Toc242517034" w:history="1">
+      <w:hyperlink w:anchor="_Toc242518831" w:history="1">
         <w:r>
           <w:rPr>
             <w:rStyle w:val="Hyperlink"/>
@@ -2722,7 +2722,7 @@
             <w:webHidden/>
             <w:sz w:val="20"/>
           </w:rPr>
-          <w:instrText xml:space="preserve"> PAGEREF _Toc242517034 \h </w:instrText>
+          <w:instrText xml:space="preserve"> PAGEREF _Toc242518831 \h </w:instrText>
         </w:r>
         <w:r>
           <w:rPr>
@@ -2769,7 +2769,7 @@
           <w:sz w:val="20"/>
         </w:rPr>
       </w:pPr>
-      <w:hyperlink w:anchor="_Toc242517035" w:history="1">
+      <w:hyperlink w:anchor="_Toc242518832" w:history="1">
         <w:r>
           <w:rPr>
             <w:rStyle w:val="Hyperlink"/>
@@ -2800,7 +2800,7 @@
             <w:webHidden/>
             <w:sz w:val="20"/>
           </w:rPr>
-          <w:instrText xml:space="preserve"> PAGEREF _Toc242517035 \h </w:instrText>
+          <w:instrText xml:space="preserve"> PAGEREF _Toc242518832 \h </w:instrText>
         </w:r>
         <w:r>
           <w:rPr>
@@ -2847,7 +2847,7 @@
           <w:sz w:val="20"/>
         </w:rPr>
       </w:pPr>
-      <w:hyperlink w:anchor="_Toc242517036" w:history="1">
+      <w:hyperlink w:anchor="_Toc242518833" w:history="1">
         <w:r>
           <w:rPr>
             <w:rStyle w:val="Hyperlink"/>
@@ -2878,7 +2878,7 @@
             <w:webHidden/>
             <w:sz w:val="20"/>
           </w:rPr>
-          <w:instrText xml:space="preserve"> PAGEREF _Toc242517036 \h </w:instrText>
+          <w:instrText xml:space="preserve"> PAGEREF _Toc242518833 \h </w:instrText>
         </w:r>
         <w:r>
           <w:rPr>
@@ -2925,7 +2925,7 @@
           <w:sz w:val="20"/>
         </w:rPr>
       </w:pPr>
-      <w:hyperlink w:anchor="_Toc242517037" w:history="1">
+      <w:hyperlink w:anchor="_Toc242518834" w:history="1">
         <w:r>
           <w:rPr>
             <w:rStyle w:val="Hyperlink"/>
@@ -2956,7 +2956,7 @@
             <w:webHidden/>
             <w:sz w:val="20"/>
           </w:rPr>
-          <w:instrText xml:space="preserve"> PAGEREF _Toc242517037 \h </w:instrText>
+          <w:instrText xml:space="preserve"> PAGEREF _Toc242518834 \h </w:instrText>
         </w:r>
         <w:r>
           <w:rPr>
@@ -3003,7 +3003,7 @@
           <w:sz w:val="20"/>
         </w:rPr>
       </w:pPr>
-      <w:hyperlink w:anchor="_Toc242517038" w:history="1">
+      <w:hyperlink w:anchor="_Toc242518835" w:history="1">
         <w:r>
           <w:rPr>
             <w:rStyle w:val="Hyperlink"/>
@@ -3034,7 +3034,7 @@
             <w:webHidden/>
             <w:sz w:val="20"/>
           </w:rPr>
-          <w:instrText xml:space="preserve"> PAGEREF _Toc242517038 \h </w:instrText>
+          <w:instrText xml:space="preserve"> PAGEREF _Toc242518835 \h </w:instrText>
         </w:r>
         <w:r>
           <w:rPr>
@@ -3081,7 +3081,7 @@
           <w:sz w:val="20"/>
         </w:rPr>
       </w:pPr>
-      <w:hyperlink w:anchor="_Toc242517039" w:history="1">
+      <w:hyperlink w:anchor="_Toc242518836" w:history="1">
         <w:r>
           <w:rPr>
             <w:rStyle w:val="Hyperlink"/>
@@ -3112,7 +3112,7 @@
             <w:webHidden/>
             <w:sz w:val="20"/>
           </w:rPr>
-          <w:instrText xml:space="preserve"> PAGEREF _Toc242517039 \h </w:instrText>
+          <w:instrText xml:space="preserve"> PAGEREF _Toc242518836 \h </w:instrText>
         </w:r>
         <w:r>
           <w:rPr>
@@ -3159,7 +3159,7 @@
           <w:sz w:val="20"/>
         </w:rPr>
       </w:pPr>
-      <w:hyperlink w:anchor="_Toc242517040" w:history="1">
+      <w:hyperlink w:anchor="_Toc242518837" w:history="1">
         <w:r>
           <w:rPr>
             <w:rStyle w:val="Hyperlink"/>
@@ -3190,7 +3190,7 @@
             <w:webHidden/>
             <w:sz w:val="20"/>
           </w:rPr>
-          <w:instrText xml:space="preserve"> PAGEREF _Toc242517040 \h </w:instrText>
+          <w:instrText xml:space="preserve"> PAGEREF _Toc242518837 \h </w:instrText>
         </w:r>
         <w:r>
           <w:rPr>
@@ -3213,7 +3213,7 @@
             <w:webHidden/>
             <w:sz w:val="20"/>
           </w:rPr>
-          <w:t>15</w:t>
+          <w:t>18</w:t>
         </w:r>
         <w:r>
           <w:rPr>
@@ -3237,7 +3237,7 @@
           <w:sz w:val="20"/>
         </w:rPr>
       </w:pPr>
-      <w:hyperlink w:anchor="_Toc242517041" w:history="1">
+      <w:hyperlink w:anchor="_Toc242518838" w:history="1">
         <w:r>
           <w:rPr>
             <w:rStyle w:val="Hyperlink"/>
@@ -3268,7 +3268,7 @@
             <w:webHidden/>
             <w:sz w:val="20"/>
           </w:rPr>
-          <w:instrText xml:space="preserve"> PAGEREF _Toc242517041 \h </w:instrText>
+          <w:instrText xml:space="preserve"> PAGEREF _Toc242518838 \h </w:instrText>
         </w:r>
         <w:r>
           <w:rPr>
@@ -3291,7 +3291,7 @@
             <w:webHidden/>
             <w:sz w:val="20"/>
           </w:rPr>
-          <w:t>16</w:t>
+          <w:t>22</w:t>
         </w:r>
         <w:r>
           <w:rPr>
@@ -3315,7 +3315,7 @@
           <w:sz w:val="20"/>
         </w:rPr>
       </w:pPr>
-      <w:hyperlink w:anchor="_Toc242517042" w:history="1">
+      <w:hyperlink w:anchor="_Toc242518839" w:history="1">
         <w:r>
           <w:rPr>
             <w:rStyle w:val="Hyperlink"/>
@@ -3346,7 +3346,7 @@
             <w:webHidden/>
             <w:sz w:val="20"/>
           </w:rPr>
-          <w:instrText xml:space="preserve"> PAGEREF _Toc242517042 \h </w:instrText>
+          <w:instrText xml:space="preserve"> PAGEREF _Toc242518839 \h </w:instrText>
         </w:r>
         <w:r>
           <w:rPr>
@@ -3369,7 +3369,7 @@
             <w:webHidden/>
             <w:sz w:val="20"/>
           </w:rPr>
-          <w:t>17</w:t>
+          <w:t>26</w:t>
         </w:r>
         <w:r>
           <w:rPr>
@@ -3397,7 +3397,7 @@
         <w:pStyle w:val="Heading1"/>
         <w:pageBreakBefore/>
       </w:pPr>
-      <w:bookmarkStart w:id="0" w:name="_Toc242517007"/>
+      <w:bookmarkStart w:id="0" w:name="_Toc242518804"/>
       <w:r>
         <w:lastRenderedPageBreak/>
         <w:t>1. Project Overview</w:t>
@@ -3408,7 +3408,7 @@
       <w:pPr>
         <w:pStyle w:val="Heading2"/>
       </w:pPr>
-      <w:bookmarkStart w:id="1" w:name="_Toc242517008"/>
+      <w:bookmarkStart w:id="1" w:name="_Toc242518805"/>
       <w:r>
         <w:t>1.1 Repository and version analysed</w:t>
       </w:r>
@@ -3902,7 +3902,7 @@
       <w:pPr>
         <w:pStyle w:val="Heading2"/>
       </w:pPr>
-      <w:bookmarkStart w:id="2" w:name="_Toc242517009"/>
+      <w:bookmarkStart w:id="2" w:name="_Toc242518806"/>
       <w:r>
         <w:t>1.2 System description and purpose</w:t>
       </w:r>
@@ -4002,7 +4002,7 @@
       <w:pPr>
         <w:pStyle w:val="Heading2"/>
       </w:pPr>
-      <w:bookmarkStart w:id="3" w:name="_Toc242517010"/>
+      <w:bookmarkStart w:id="3" w:name="_Toc242518807"/>
       <w:r>
         <w:t>1.3 Size and module count</w:t>
       </w:r>
@@ -5057,7 +5057,7 @@
       <w:pPr>
         <w:pStyle w:val="Heading1"/>
       </w:pPr>
-      <w:bookmarkStart w:id="4" w:name="_Toc242517011"/>
+      <w:bookmarkStart w:id="4" w:name="_Toc242518808"/>
       <w:r>
         <w:t>2. Inventory Analysis</w:t>
       </w:r>
@@ -5067,7 +5067,7 @@
       <w:pPr>
         <w:pStyle w:val="Heading2"/>
       </w:pPr>
-      <w:bookmarkStart w:id="5" w:name="_Toc242517012"/>
+      <w:bookmarkStart w:id="5" w:name="_Toc242518809"/>
       <w:r>
         <w:t>2.1 Project assets</w:t>
       </w:r>
@@ -6241,7 +6241,7 @@
       <w:pPr>
         <w:pStyle w:val="Heading2"/>
       </w:pPr>
-      <w:bookmarkStart w:id="6" w:name="_Toc242517013"/>
+      <w:bookmarkStart w:id="6" w:name="_Toc242518810"/>
       <w:r>
         <w:t>2.2 Classification of assets</w:t>
       </w:r>
@@ -7673,7 +7673,7 @@
       <w:pPr>
         <w:pStyle w:val="Heading2"/>
       </w:pPr>
-      <w:bookmarkStart w:id="7" w:name="_Toc242517014"/>
+      <w:bookmarkStart w:id="7" w:name="_Toc242518811"/>
       <w:r>
         <w:t>2.3 Quality metrics per module</w:t>
       </w:r>
@@ -17644,7 +17644,7 @@
       <w:pPr>
         <w:pStyle w:val="Heading2"/>
       </w:pPr>
-      <w:bookmarkStart w:id="8" w:name="_Toc242517015"/>
+      <w:bookmarkStart w:id="8" w:name="_Toc242518812"/>
       <w:r>
         <w:t>2.4 Dependency mapping</w:t>
       </w:r>
@@ -17661,7 +17661,7 @@
           <w:noProof/>
         </w:rPr>
         <w:drawing>
-          <wp:inline distT="0" distB="0" distL="0" distR="0" wp14:anchorId="4E75CC98" wp14:editId="1836CEBE">
+          <wp:inline distT="0" distB="0" distL="0" distR="0" wp14:anchorId="4065A96C" wp14:editId="17217199">
             <wp:extent cx="5400000" cy="2978814"/>
             <wp:effectExtent l="0" t="0" r="0" b="0"/>
             <wp:docPr id="1" name="Picture 1"/>
@@ -18879,7 +18879,7 @@
       <w:pPr>
         <w:pStyle w:val="Heading1"/>
       </w:pPr>
-      <w:bookmarkStart w:id="9" w:name="_Toc242517016"/>
+      <w:bookmarkStart w:id="9" w:name="_Toc242518813"/>
       <w:r>
         <w:t>3. Tool-Based Metrics</w:t>
       </w:r>
@@ -19655,7 +19655,7 @@
       <w:pPr>
         <w:pStyle w:val="Heading2"/>
       </w:pPr>
-      <w:bookmarkStart w:id="10" w:name="_Toc242517017"/>
+      <w:bookmarkStart w:id="10" w:name="_Toc242518814"/>
       <w:r>
         <w:t>3.1 Cyclomatic complexity</w:t>
       </w:r>
@@ -19678,7 +19678,7 @@
         </w:rPr>
         <w:lastRenderedPageBreak/>
         <w:drawing>
-          <wp:inline distT="0" distB="0" distL="0" distR="0" wp14:anchorId="09A61B9B" wp14:editId="447DAED9">
+          <wp:inline distT="0" distB="0" distL="0" distR="0" wp14:anchorId="790FBA7E" wp14:editId="6B7271A7">
             <wp:extent cx="3960000" cy="2278444"/>
             <wp:effectExtent l="0" t="0" r="0" b="0"/>
             <wp:docPr id="2" name="Picture 2"/>
@@ -19732,7 +19732,7 @@
       <w:pPr>
         <w:pStyle w:val="Heading2"/>
       </w:pPr>
-      <w:bookmarkStart w:id="11" w:name="_Toc242517018"/>
+      <w:bookmarkStart w:id="11" w:name="_Toc242518815"/>
       <w:r>
         <w:t>3.2 Cognitive complexity</w:t>
       </w:r>
@@ -21125,7 +21125,7 @@
       <w:pPr>
         <w:pStyle w:val="Heading2"/>
       </w:pPr>
-      <w:bookmarkStart w:id="12" w:name="_Toc242517019"/>
+      <w:bookmarkStart w:id="12" w:name="_Toc242518816"/>
       <w:r>
         <w:t>3.3 Code duplication</w:t>
       </w:r>
@@ -21653,7 +21653,7 @@
       <w:pPr>
         <w:pStyle w:val="Heading2"/>
       </w:pPr>
-      <w:bookmarkStart w:id="13" w:name="_Toc242517020"/>
+      <w:bookmarkStart w:id="13" w:name="_Toc242518817"/>
       <w:r>
         <w:t>3.4 Test coverage</w:t>
       </w:r>
@@ -22490,7 +22490,7 @@
       <w:pPr>
         <w:pStyle w:val="Heading2"/>
       </w:pPr>
-      <w:bookmarkStart w:id="14" w:name="_Toc242517021"/>
+      <w:bookmarkStart w:id="14" w:name="_Toc242518818"/>
       <w:r>
         <w:t>3.5 Bugs, vulnerabilities and code smells</w:t>
       </w:r>
@@ -23859,7 +23859,7 @@
       <w:pPr>
         <w:pStyle w:val="Heading2"/>
       </w:pPr>
-      <w:bookmarkStart w:id="15" w:name="_Toc242517022"/>
+      <w:bookmarkStart w:id="15" w:name="_Toc242518819"/>
       <w:r>
         <w:t>3.6 Maintainability index</w:t>
       </w:r>
@@ -24662,7 +24662,7 @@
       <w:pPr>
         <w:pStyle w:val="Heading1"/>
       </w:pPr>
-      <w:bookmarkStart w:id="16" w:name="_Toc242517023"/>
+      <w:bookmarkStart w:id="16" w:name="_Toc242518820"/>
       <w:r>
         <w:t>4. Debt Identification</w:t>
       </w:r>
@@ -25825,7 +25825,7 @@
       <w:pPr>
         <w:pStyle w:val="Heading2"/>
       </w:pPr>
-      <w:bookmarkStart w:id="17" w:name="_Toc242517024"/>
+      <w:bookmarkStart w:id="17" w:name="_Toc242518821"/>
       <w:r>
         <w:t>4.1 Example of code debt: a deeply nested method (TD-01)</w:t>
       </w:r>
@@ -26035,7 +26035,7 @@
       <w:pPr>
         <w:pStyle w:val="Heading2"/>
       </w:pPr>
-      <w:bookmarkStart w:id="18" w:name="_Toc242517025"/>
+      <w:bookmarkStart w:id="18" w:name="_Toc242518822"/>
       <w:r>
         <w:t>4.2 Example of design debt: one fix, two copies (TD-03)</w:t>
       </w:r>
@@ -26174,7 +26174,7 @@
       <w:pPr>
         <w:pStyle w:val="Heading2"/>
       </w:pPr>
-      <w:bookmarkStart w:id="19" w:name="_Toc242517026"/>
+      <w:bookmarkStart w:id="19" w:name="_Toc242518823"/>
       <w:r>
         <w:t>4.3 Example of test debt: tests tied to one library release (TD-04)</w:t>
       </w:r>
@@ -26278,7 +26278,7 @@
       <w:pPr>
         <w:pStyle w:val="Heading2"/>
       </w:pPr>
-      <w:bookmarkStart w:id="20" w:name="_Toc242517027"/>
+      <w:bookmarkStart w:id="20" w:name="_Toc242518824"/>
       <w:r>
         <w:t>4.4 Example of documentation debt (TD-05)</w:t>
       </w:r>
@@ -26347,7 +26347,7 @@
       <w:pPr>
         <w:pStyle w:val="Heading2"/>
       </w:pPr>
-      <w:bookmarkStart w:id="21" w:name="_Toc242517028"/>
+      <w:bookmarkStart w:id="21" w:name="_Toc242518825"/>
       <w:r>
         <w:lastRenderedPageBreak/>
         <w:t>4.5 Example of infrastructure debt (TD-06)</w:t>
@@ -26370,7 +26370,7 @@
       <w:pPr>
         <w:pStyle w:val="Heading1"/>
       </w:pPr>
-      <w:bookmarkStart w:id="22" w:name="_Toc242517029"/>
+      <w:bookmarkStart w:id="22" w:name="_Toc242518826"/>
       <w:r>
         <w:t>5. Remediation Cost and Debt Ratio</w:t>
       </w:r>
@@ -26380,7 +26380,7 @@
       <w:pPr>
         <w:pStyle w:val="Heading2"/>
       </w:pPr>
-      <w:bookmarkStart w:id="23" w:name="_Toc242517030"/>
+      <w:bookmarkStart w:id="23" w:name="_Toc242518827"/>
       <w:r>
         <w:t>5.1 Method</w:t>
       </w:r>
@@ -26472,7 +26472,7 @@
       <w:pPr>
         <w:pStyle w:val="Heading2"/>
       </w:pPr>
-      <w:bookmarkStart w:id="24" w:name="_Toc242517031"/>
+      <w:bookmarkStart w:id="24" w:name="_Toc242518828"/>
       <w:r>
         <w:t>5.2 Tool outputs and cost per item</w:t>
       </w:r>
@@ -29504,7 +29504,7 @@
       <w:pPr>
         <w:pStyle w:val="Heading2"/>
       </w:pPr>
-      <w:bookmarkStart w:id="25" w:name="_Toc242517032"/>
+      <w:bookmarkStart w:id="25" w:name="_Toc242518829"/>
       <w:r>
         <w:t>5.3 Technical Debt Ratio</w:t>
       </w:r>
@@ -30094,7 +30094,7 @@
       <w:pPr>
         <w:pStyle w:val="Heading1"/>
       </w:pPr>
-      <w:bookmarkStart w:id="26" w:name="_Toc242517033"/>
+      <w:bookmarkStart w:id="26" w:name="_Toc242518830"/>
       <w:r>
         <w:t>6. Prioritization Strategy</w:t>
       </w:r>
@@ -30104,7 +30104,7 @@
       <w:pPr>
         <w:pStyle w:val="Heading2"/>
       </w:pPr>
-      <w:bookmarkStart w:id="27" w:name="_Toc242517034"/>
+      <w:bookmarkStart w:id="27" w:name="_Toc242518831"/>
       <w:r>
         <w:t>6.1 Technique 1: hotspot analysis</w:t>
       </w:r>
@@ -30136,7 +30136,7 @@
           <w:noProof/>
         </w:rPr>
         <w:drawing>
-          <wp:inline distT="0" distB="0" distL="0" distR="0" wp14:anchorId="24A994BF" wp14:editId="18BC3C08">
+          <wp:inline distT="0" distB="0" distL="0" distR="0" wp14:anchorId="207EF381" wp14:editId="41505BA1">
             <wp:extent cx="4320000" cy="2959287"/>
             <wp:effectExtent l="0" t="0" r="0" b="0"/>
             <wp:docPr id="3" name="Picture 3"/>
@@ -31468,7 +31468,7 @@
       <w:pPr>
         <w:pStyle w:val="Heading2"/>
       </w:pPr>
-      <w:bookmarkStart w:id="28" w:name="_Toc242517035"/>
+      <w:bookmarkStart w:id="28" w:name="_Toc242518832"/>
       <w:r>
         <w:lastRenderedPageBreak/>
         <w:t>6.2 Technique 2: weighted scoring model</w:t>
@@ -33997,7 +33997,7 @@
       <w:pPr>
         <w:pStyle w:val="Heading2"/>
       </w:pPr>
-      <w:bookmarkStart w:id="29" w:name="_Toc242517036"/>
+      <w:bookmarkStart w:id="29" w:name="_Toc242518833"/>
       <w:r>
         <w:t>6.3 Prioritised order and justification</w:t>
       </w:r>
@@ -35194,7 +35194,7 @@
       <w:pPr>
         <w:pStyle w:val="Heading1"/>
       </w:pPr>
-      <w:bookmarkStart w:id="30" w:name="_Toc242517037"/>
+      <w:bookmarkStart w:id="30" w:name="_Toc242518834"/>
       <w:r>
         <w:t>7. Reflection</w:t>
       </w:r>
@@ -35361,7 +35361,7 @@
         <w:pStyle w:val="Heading1"/>
         <w:pageBreakBefore/>
       </w:pPr>
-      <w:bookmarkStart w:id="31" w:name="_Toc242517038"/>
+      <w:bookmarkStart w:id="31" w:name="_Toc242518835"/>
       <w:r>
         <w:lastRenderedPageBreak/>
         <w:t>Appendix A. Individual Component: Manual Calculations</w:t>
@@ -35570,7 +35570,7 @@
       <w:pPr>
         <w:pStyle w:val="Heading2"/>
       </w:pPr>
-      <w:bookmarkStart w:id="32" w:name="_Toc242517039"/>
+      <w:bookmarkStart w:id="32" w:name="_Toc242518836"/>
       <w:r>
         <w:t>A.1  Member 1: Taha Yasir (i222429)</w:t>
       </w:r>
@@ -37022,14 +37022,215 @@
     </w:p>
     <w:p>
       <w:pPr>
-        <w:spacing w:before="200"/>
+        <w:pStyle w:val="Heading3"/>
+        <w:pageBreakBefore/>
+      </w:pPr>
+      <w:r>
+        <w:lastRenderedPageBreak/>
+        <w:t>Handwritten calculations: Taha Yasir, sheet 1 of 3</w:t>
+      </w:r>
+    </w:p>
+    <w:p>
+      <w:pPr>
+        <w:keepNext/>
+        <w:spacing w:after="40"/>
         <w:jc w:val="center"/>
       </w:pPr>
       <w:r>
         <w:rPr>
+          <w:noProof/>
+        </w:rPr>
+        <w:drawing>
+          <wp:inline distT="0" distB="0" distL="0" distR="0" wp14:anchorId="42D7F911" wp14:editId="727AE940">
+            <wp:extent cx="5220000" cy="6960000"/>
+            <wp:effectExtent l="0" t="0" r="0" b="0"/>
+            <wp:docPr id="4" name="Picture 4"/>
+            <wp:cNvGraphicFramePr>
+              <a:graphicFrameLocks xmlns:a="http://schemas.openxmlformats.org/drawingml/2006/main" noChangeAspect="1"/>
+            </wp:cNvGraphicFramePr>
+            <a:graphic xmlns:a="http://schemas.openxmlformats.org/drawingml/2006/main">
+              <a:graphicData uri="http://schemas.openxmlformats.org/drawingml/2006/picture">
+                <pic:pic xmlns:pic="http://schemas.openxmlformats.org/drawingml/2006/picture">
+                  <pic:nvPicPr>
+                    <pic:cNvPr id="0" name="taha_1_def_list.jpg"/>
+                    <pic:cNvPicPr/>
+                  </pic:nvPicPr>
+                  <pic:blipFill>
+                    <a:blip r:embed="rId14"/>
+                    <a:stretch>
+                      <a:fillRect/>
+                    </a:stretch>
+                  </pic:blipFill>
+                  <pic:spPr>
+                    <a:xfrm>
+                      <a:off x="0" y="0"/>
+                      <a:ext cx="5220000" cy="6960000"/>
+                    </a:xfrm>
+                    <a:prstGeom prst="rect">
+                      <a:avLst/>
+                    </a:prstGeom>
+                  </pic:spPr>
+                </pic:pic>
+              </a:graphicData>
+            </a:graphic>
+          </wp:inline>
+        </w:drawing>
+      </w:r>
+    </w:p>
+    <w:p>
+      <w:pPr>
+        <w:spacing w:after="160"/>
+        <w:jc w:val="center"/>
+      </w:pPr>
+      <w:r>
+        <w:rPr>
+          <w:i/>
           <w:color w:val="5A5A5A"/>
+          <w:sz w:val="18"/>
         </w:rPr>
-        <w:t>[ Insert Taha Yasir's scanned handwritten calculation sheets after this page ]</w:t>
+        <w:t>def_list.py: comment density, cyclomatic and cognitive complexity</w:t>
+      </w:r>
+    </w:p>
+    <w:p>
+      <w:pPr>
+        <w:pStyle w:val="Heading3"/>
+        <w:pageBreakBefore/>
+      </w:pPr>
+      <w:r>
+        <w:lastRenderedPageBreak/>
+        <w:t>Handwritten calculations: Taha Yasir, sheet 2 of 3</w:t>
+      </w:r>
+    </w:p>
+    <w:p>
+      <w:pPr>
+        <w:keepNext/>
+        <w:spacing w:after="40"/>
+        <w:jc w:val="center"/>
+      </w:pPr>
+      <w:r>
+        <w:rPr>
+          <w:noProof/>
+        </w:rPr>
+        <w:drawing>
+          <wp:inline distT="0" distB="0" distL="0" distR="0" wp14:anchorId="7053218D" wp14:editId="403B0E3E">
+            <wp:extent cx="5220000" cy="6960000"/>
+            <wp:effectExtent l="0" t="0" r="0" b="0"/>
+            <wp:docPr id="5" name="Picture 5"/>
+            <wp:cNvGraphicFramePr>
+              <a:graphicFrameLocks xmlns:a="http://schemas.openxmlformats.org/drawingml/2006/main" noChangeAspect="1"/>
+            </wp:cNvGraphicFramePr>
+            <a:graphic xmlns:a="http://schemas.openxmlformats.org/drawingml/2006/main">
+              <a:graphicData uri="http://schemas.openxmlformats.org/drawingml/2006/picture">
+                <pic:pic xmlns:pic="http://schemas.openxmlformats.org/drawingml/2006/picture">
+                  <pic:nvPicPr>
+                    <pic:cNvPr id="0" name="taha_2_meta.jpg"/>
+                    <pic:cNvPicPr/>
+                  </pic:nvPicPr>
+                  <pic:blipFill>
+                    <a:blip r:embed="rId15"/>
+                    <a:stretch>
+                      <a:fillRect/>
+                    </a:stretch>
+                  </pic:blipFill>
+                  <pic:spPr>
+                    <a:xfrm>
+                      <a:off x="0" y="0"/>
+                      <a:ext cx="5220000" cy="6960000"/>
+                    </a:xfrm>
+                    <a:prstGeom prst="rect">
+                      <a:avLst/>
+                    </a:prstGeom>
+                  </pic:spPr>
+                </pic:pic>
+              </a:graphicData>
+            </a:graphic>
+          </wp:inline>
+        </w:drawing>
+      </w:r>
+    </w:p>
+    <w:p>
+      <w:pPr>
+        <w:spacing w:after="160"/>
+        <w:jc w:val="center"/>
+      </w:pPr>
+      <w:r>
+        <w:rPr>
+          <w:i/>
+          <w:color w:val="5A5A5A"/>
+          <w:sz w:val="18"/>
+        </w:rPr>
+        <w:t>def_list.py summary; meta.py: comment density and cyclomatic complexity</w:t>
+      </w:r>
+    </w:p>
+    <w:p>
+      <w:pPr>
+        <w:pStyle w:val="Heading3"/>
+        <w:pageBreakBefore/>
+      </w:pPr>
+      <w:r>
+        <w:lastRenderedPageBreak/>
+        <w:t>Handwritten calculations: Taha Yasir, sheet 3 of 3</w:t>
+      </w:r>
+    </w:p>
+    <w:p>
+      <w:pPr>
+        <w:keepNext/>
+        <w:spacing w:after="40"/>
+        <w:jc w:val="center"/>
+      </w:pPr>
+      <w:r>
+        <w:rPr>
+          <w:noProof/>
+        </w:rPr>
+        <w:drawing>
+          <wp:inline distT="0" distB="0" distL="0" distR="0" wp14:anchorId="349E2948" wp14:editId="32A270F2">
+            <wp:extent cx="5220000" cy="6960000"/>
+            <wp:effectExtent l="0" t="0" r="0" b="0"/>
+            <wp:docPr id="6" name="Picture 6"/>
+            <wp:cNvGraphicFramePr>
+              <a:graphicFrameLocks xmlns:a="http://schemas.openxmlformats.org/drawingml/2006/main" noChangeAspect="1"/>
+            </wp:cNvGraphicFramePr>
+            <a:graphic xmlns:a="http://schemas.openxmlformats.org/drawingml/2006/main">
+              <a:graphicData uri="http://schemas.openxmlformats.org/drawingml/2006/picture">
+                <pic:pic xmlns:pic="http://schemas.openxmlformats.org/drawingml/2006/picture">
+                  <pic:nvPicPr>
+                    <pic:cNvPr id="0" name="taha_3_meta_cognitive.jpg"/>
+                    <pic:cNvPicPr/>
+                  </pic:nvPicPr>
+                  <pic:blipFill>
+                    <a:blip r:embed="rId16"/>
+                    <a:stretch>
+                      <a:fillRect/>
+                    </a:stretch>
+                  </pic:blipFill>
+                  <pic:spPr>
+                    <a:xfrm>
+                      <a:off x="0" y="0"/>
+                      <a:ext cx="5220000" cy="6960000"/>
+                    </a:xfrm>
+                    <a:prstGeom prst="rect">
+                      <a:avLst/>
+                    </a:prstGeom>
+                  </pic:spPr>
+                </pic:pic>
+              </a:graphicData>
+            </a:graphic>
+          </wp:inline>
+        </w:drawing>
+      </w:r>
+    </w:p>
+    <w:p>
+      <w:pPr>
+        <w:spacing w:after="160"/>
+        <w:jc w:val="center"/>
+      </w:pPr>
+      <w:r>
+        <w:rPr>
+          <w:i/>
+          <w:color w:val="5A5A5A"/>
+          <w:sz w:val="18"/>
+        </w:rPr>
+        <w:t>meta.py: cognitive complexity and summary</w:t>
       </w:r>
     </w:p>
     <w:p>
@@ -37037,7 +37238,7 @@
         <w:pStyle w:val="Heading2"/>
         <w:pageBreakBefore/>
       </w:pPr>
-      <w:bookmarkStart w:id="33" w:name="_Toc242517040"/>
+      <w:bookmarkStart w:id="33" w:name="_Toc242518837"/>
       <w:r>
         <w:lastRenderedPageBreak/>
         <w:t>A.2  Member 2: Khizar (i222595)</w:t>
@@ -38844,14 +39045,215 @@
     </w:p>
     <w:p>
       <w:pPr>
-        <w:spacing w:before="200"/>
+        <w:pStyle w:val="Heading3"/>
+        <w:pageBreakBefore/>
+      </w:pPr>
+      <w:r>
+        <w:lastRenderedPageBreak/>
+        <w:t>Handwritten calculations: Khizar, sheet 1 of 3</w:t>
+      </w:r>
+    </w:p>
+    <w:p>
+      <w:pPr>
+        <w:keepNext/>
+        <w:spacing w:after="40"/>
         <w:jc w:val="center"/>
       </w:pPr>
       <w:r>
         <w:rPr>
+          <w:noProof/>
+        </w:rPr>
+        <w:drawing>
+          <wp:inline distT="0" distB="0" distL="0" distR="0" wp14:anchorId="1CD3B9D3" wp14:editId="018C9931">
+            <wp:extent cx="5220000" cy="6960000"/>
+            <wp:effectExtent l="0" t="0" r="0" b="0"/>
+            <wp:docPr id="7" name="Picture 7"/>
+            <wp:cNvGraphicFramePr>
+              <a:graphicFrameLocks xmlns:a="http://schemas.openxmlformats.org/drawingml/2006/main" noChangeAspect="1"/>
+            </wp:cNvGraphicFramePr>
+            <a:graphic xmlns:a="http://schemas.openxmlformats.org/drawingml/2006/main">
+              <a:graphicData uri="http://schemas.openxmlformats.org/drawingml/2006/picture">
+                <pic:pic xmlns:pic="http://schemas.openxmlformats.org/drawingml/2006/picture">
+                  <pic:nvPicPr>
+                    <pic:cNvPr id="0" name="khizar_1_admonition.jpg"/>
+                    <pic:cNvPicPr/>
+                  </pic:nvPicPr>
+                  <pic:blipFill>
+                    <a:blip r:embed="rId17"/>
+                    <a:stretch>
+                      <a:fillRect/>
+                    </a:stretch>
+                  </pic:blipFill>
+                  <pic:spPr>
+                    <a:xfrm>
+                      <a:off x="0" y="0"/>
+                      <a:ext cx="5220000" cy="6960000"/>
+                    </a:xfrm>
+                    <a:prstGeom prst="rect">
+                      <a:avLst/>
+                    </a:prstGeom>
+                  </pic:spPr>
+                </pic:pic>
+              </a:graphicData>
+            </a:graphic>
+          </wp:inline>
+        </w:drawing>
+      </w:r>
+    </w:p>
+    <w:p>
+      <w:pPr>
+        <w:spacing w:after="160"/>
+        <w:jc w:val="center"/>
+      </w:pPr>
+      <w:r>
+        <w:rPr>
+          <w:i/>
           <w:color w:val="5A5A5A"/>
+          <w:sz w:val="18"/>
         </w:rPr>
-        <w:t>[ Insert Khizar's scanned handwritten calculation sheets after this page ]</w:t>
+        <w:t>admonition.py: comment density, cyclomatic and cognitive complexity</w:t>
+      </w:r>
+    </w:p>
+    <w:p>
+      <w:pPr>
+        <w:pStyle w:val="Heading3"/>
+        <w:pageBreakBefore/>
+      </w:pPr>
+      <w:r>
+        <w:lastRenderedPageBreak/>
+        <w:t>Handwritten calculations: Khizar, sheet 2 of 3</w:t>
+      </w:r>
+    </w:p>
+    <w:p>
+      <w:pPr>
+        <w:keepNext/>
+        <w:spacing w:after="40"/>
+        <w:jc w:val="center"/>
+      </w:pPr>
+      <w:r>
+        <w:rPr>
+          <w:noProof/>
+        </w:rPr>
+        <w:drawing>
+          <wp:inline distT="0" distB="0" distL="0" distR="0" wp14:anchorId="09DD8F7F" wp14:editId="13D6B270">
+            <wp:extent cx="5220000" cy="6960000"/>
+            <wp:effectExtent l="0" t="0" r="0" b="0"/>
+            <wp:docPr id="8" name="Picture 8"/>
+            <wp:cNvGraphicFramePr>
+              <a:graphicFrameLocks xmlns:a="http://schemas.openxmlformats.org/drawingml/2006/main" noChangeAspect="1"/>
+            </wp:cNvGraphicFramePr>
+            <a:graphic xmlns:a="http://schemas.openxmlformats.org/drawingml/2006/main">
+              <a:graphicData uri="http://schemas.openxmlformats.org/drawingml/2006/picture">
+                <pic:pic xmlns:pic="http://schemas.openxmlformats.org/drawingml/2006/picture">
+                  <pic:nvPicPr>
+                    <pic:cNvPr id="0" name="khizar_2_wikilinks.jpg"/>
+                    <pic:cNvPicPr/>
+                  </pic:nvPicPr>
+                  <pic:blipFill>
+                    <a:blip r:embed="rId18"/>
+                    <a:stretch>
+                      <a:fillRect/>
+                    </a:stretch>
+                  </pic:blipFill>
+                  <pic:spPr>
+                    <a:xfrm>
+                      <a:off x="0" y="0"/>
+                      <a:ext cx="5220000" cy="6960000"/>
+                    </a:xfrm>
+                    <a:prstGeom prst="rect">
+                      <a:avLst/>
+                    </a:prstGeom>
+                  </pic:spPr>
+                </pic:pic>
+              </a:graphicData>
+            </a:graphic>
+          </wp:inline>
+        </w:drawing>
+      </w:r>
+    </w:p>
+    <w:p>
+      <w:pPr>
+        <w:spacing w:after="160"/>
+        <w:jc w:val="center"/>
+      </w:pPr>
+      <w:r>
+        <w:rPr>
+          <w:i/>
+          <w:color w:val="5A5A5A"/>
+          <w:sz w:val="18"/>
+        </w:rPr>
+        <w:t>admonition.py summary; wikilinks.py: comment density and cyclomatic complexity</w:t>
+      </w:r>
+    </w:p>
+    <w:p>
+      <w:pPr>
+        <w:pStyle w:val="Heading3"/>
+        <w:pageBreakBefore/>
+      </w:pPr>
+      <w:r>
+        <w:lastRenderedPageBreak/>
+        <w:t>Handwritten calculations: Khizar, sheet 3 of 3</w:t>
+      </w:r>
+    </w:p>
+    <w:p>
+      <w:pPr>
+        <w:keepNext/>
+        <w:spacing w:after="40"/>
+        <w:jc w:val="center"/>
+      </w:pPr>
+      <w:r>
+        <w:rPr>
+          <w:noProof/>
+        </w:rPr>
+        <w:drawing>
+          <wp:inline distT="0" distB="0" distL="0" distR="0" wp14:anchorId="2E88339D" wp14:editId="3A30E3B7">
+            <wp:extent cx="5220000" cy="6960000"/>
+            <wp:effectExtent l="0" t="0" r="0" b="0"/>
+            <wp:docPr id="9" name="Picture 9"/>
+            <wp:cNvGraphicFramePr>
+              <a:graphicFrameLocks xmlns:a="http://schemas.openxmlformats.org/drawingml/2006/main" noChangeAspect="1"/>
+            </wp:cNvGraphicFramePr>
+            <a:graphic xmlns:a="http://schemas.openxmlformats.org/drawingml/2006/main">
+              <a:graphicData uri="http://schemas.openxmlformats.org/drawingml/2006/picture">
+                <pic:pic xmlns:pic="http://schemas.openxmlformats.org/drawingml/2006/picture">
+                  <pic:nvPicPr>
+                    <pic:cNvPr id="0" name="khizar_3_wikilinks_cognitive.jpg"/>
+                    <pic:cNvPicPr/>
+                  </pic:nvPicPr>
+                  <pic:blipFill>
+                    <a:blip r:embed="rId19"/>
+                    <a:stretch>
+                      <a:fillRect/>
+                    </a:stretch>
+                  </pic:blipFill>
+                  <pic:spPr>
+                    <a:xfrm>
+                      <a:off x="0" y="0"/>
+                      <a:ext cx="5220000" cy="6960000"/>
+                    </a:xfrm>
+                    <a:prstGeom prst="rect">
+                      <a:avLst/>
+                    </a:prstGeom>
+                  </pic:spPr>
+                </pic:pic>
+              </a:graphicData>
+            </a:graphic>
+          </wp:inline>
+        </w:drawing>
+      </w:r>
+    </w:p>
+    <w:p>
+      <w:pPr>
+        <w:spacing w:after="160"/>
+        <w:jc w:val="center"/>
+      </w:pPr>
+      <w:r>
+        <w:rPr>
+          <w:i/>
+          <w:color w:val="5A5A5A"/>
+          <w:sz w:val="18"/>
+        </w:rPr>
+        <w:t>wikilinks.py: cognitive complexity and summary</w:t>
       </w:r>
     </w:p>
     <w:p>
@@ -38859,7 +39261,7 @@
         <w:pStyle w:val="Heading2"/>
         <w:pageBreakBefore/>
       </w:pPr>
-      <w:bookmarkStart w:id="34" w:name="_Toc242517041"/>
+      <w:bookmarkStart w:id="34" w:name="_Toc242518838"/>
       <w:r>
         <w:lastRenderedPageBreak/>
         <w:t>A.3  Member 3: Hadeed Abbas (i228780)</w:t>
@@ -40494,14 +40896,215 @@
     </w:p>
     <w:p>
       <w:pPr>
-        <w:spacing w:before="200"/>
+        <w:pStyle w:val="Heading3"/>
+        <w:pageBreakBefore/>
+      </w:pPr>
+      <w:r>
+        <w:lastRenderedPageBreak/>
+        <w:t>Handwritten calculations: Hadeed Abbas, sheet 1 of 3</w:t>
+      </w:r>
+    </w:p>
+    <w:p>
+      <w:pPr>
+        <w:keepNext/>
+        <w:spacing w:after="40"/>
         <w:jc w:val="center"/>
       </w:pPr>
       <w:r>
         <w:rPr>
+          <w:noProof/>
+        </w:rPr>
+        <w:drawing>
+          <wp:inline distT="0" distB="0" distL="0" distR="0" wp14:anchorId="009CC53B" wp14:editId="194706DB">
+            <wp:extent cx="5220000" cy="6960000"/>
+            <wp:effectExtent l="0" t="0" r="0" b="0"/>
+            <wp:docPr id="10" name="Picture 10"/>
+            <wp:cNvGraphicFramePr>
+              <a:graphicFrameLocks xmlns:a="http://schemas.openxmlformats.org/drawingml/2006/main" noChangeAspect="1"/>
+            </wp:cNvGraphicFramePr>
+            <a:graphic xmlns:a="http://schemas.openxmlformats.org/drawingml/2006/main">
+              <a:graphicData uri="http://schemas.openxmlformats.org/drawingml/2006/picture">
+                <pic:pic xmlns:pic="http://schemas.openxmlformats.org/drawingml/2006/picture">
+                  <pic:nvPicPr>
+                    <pic:cNvPr id="0" name="hadeed_1_postprocessors.jpg"/>
+                    <pic:cNvPicPr/>
+                  </pic:nvPicPr>
+                  <pic:blipFill>
+                    <a:blip r:embed="rId20"/>
+                    <a:stretch>
+                      <a:fillRect/>
+                    </a:stretch>
+                  </pic:blipFill>
+                  <pic:spPr>
+                    <a:xfrm>
+                      <a:off x="0" y="0"/>
+                      <a:ext cx="5220000" cy="6960000"/>
+                    </a:xfrm>
+                    <a:prstGeom prst="rect">
+                      <a:avLst/>
+                    </a:prstGeom>
+                  </pic:spPr>
+                </pic:pic>
+              </a:graphicData>
+            </a:graphic>
+          </wp:inline>
+        </w:drawing>
+      </w:r>
+    </w:p>
+    <w:p>
+      <w:pPr>
+        <w:spacing w:after="160"/>
+        <w:jc w:val="center"/>
+      </w:pPr>
+      <w:r>
+        <w:rPr>
+          <w:i/>
           <w:color w:val="5A5A5A"/>
+          <w:sz w:val="18"/>
         </w:rPr>
-        <w:t>[ Insert Hadeed Abbas's scanned handwritten calculation sheets after this page ]</w:t>
+        <w:t>postprocessors.py: comment density and cyclomatic complexity</w:t>
+      </w:r>
+    </w:p>
+    <w:p>
+      <w:pPr>
+        <w:pStyle w:val="Heading3"/>
+        <w:pageBreakBefore/>
+      </w:pPr>
+      <w:r>
+        <w:lastRenderedPageBreak/>
+        <w:t>Handwritten calculations: Hadeed Abbas, sheet 2 of 3</w:t>
+      </w:r>
+    </w:p>
+    <w:p>
+      <w:pPr>
+        <w:keepNext/>
+        <w:spacing w:after="40"/>
+        <w:jc w:val="center"/>
+      </w:pPr>
+      <w:r>
+        <w:rPr>
+          <w:noProof/>
+        </w:rPr>
+        <w:drawing>
+          <wp:inline distT="0" distB="0" distL="0" distR="0" wp14:anchorId="54DECFA8" wp14:editId="02D14C0B">
+            <wp:extent cx="5220000" cy="6960000"/>
+            <wp:effectExtent l="0" t="0" r="0" b="0"/>
+            <wp:docPr id="11" name="Picture 11"/>
+            <wp:cNvGraphicFramePr>
+              <a:graphicFrameLocks xmlns:a="http://schemas.openxmlformats.org/drawingml/2006/main" noChangeAspect="1"/>
+            </wp:cNvGraphicFramePr>
+            <a:graphic xmlns:a="http://schemas.openxmlformats.org/drawingml/2006/main">
+              <a:graphicData uri="http://schemas.openxmlformats.org/drawingml/2006/picture">
+                <pic:pic xmlns:pic="http://schemas.openxmlformats.org/drawingml/2006/picture">
+                  <pic:nvPicPr>
+                    <pic:cNvPr id="0" name="hadeed_2_legacy_attrs.jpg"/>
+                    <pic:cNvPicPr/>
+                  </pic:nvPicPr>
+                  <pic:blipFill>
+                    <a:blip r:embed="rId21"/>
+                    <a:stretch>
+                      <a:fillRect/>
+                    </a:stretch>
+                  </pic:blipFill>
+                  <pic:spPr>
+                    <a:xfrm>
+                      <a:off x="0" y="0"/>
+                      <a:ext cx="5220000" cy="6960000"/>
+                    </a:xfrm>
+                    <a:prstGeom prst="rect">
+                      <a:avLst/>
+                    </a:prstGeom>
+                  </pic:spPr>
+                </pic:pic>
+              </a:graphicData>
+            </a:graphic>
+          </wp:inline>
+        </w:drawing>
+      </w:r>
+    </w:p>
+    <w:p>
+      <w:pPr>
+        <w:spacing w:after="160"/>
+        <w:jc w:val="center"/>
+      </w:pPr>
+      <w:r>
+        <w:rPr>
+          <w:i/>
+          <w:color w:val="5A5A5A"/>
+          <w:sz w:val="18"/>
+        </w:rPr>
+        <w:t>postprocessors.py cognitive complexity and summary; legacy_attrs.py: comment density</w:t>
+      </w:r>
+    </w:p>
+    <w:p>
+      <w:pPr>
+        <w:pStyle w:val="Heading3"/>
+        <w:pageBreakBefore/>
+      </w:pPr>
+      <w:r>
+        <w:lastRenderedPageBreak/>
+        <w:t>Handwritten calculations: Hadeed Abbas, sheet 3 of 3</w:t>
+      </w:r>
+    </w:p>
+    <w:p>
+      <w:pPr>
+        <w:keepNext/>
+        <w:spacing w:after="40"/>
+        <w:jc w:val="center"/>
+      </w:pPr>
+      <w:r>
+        <w:rPr>
+          <w:noProof/>
+        </w:rPr>
+        <w:drawing>
+          <wp:inline distT="0" distB="0" distL="0" distR="0" wp14:anchorId="325F0249" wp14:editId="01E77E85">
+            <wp:extent cx="5220000" cy="6960000"/>
+            <wp:effectExtent l="0" t="0" r="0" b="0"/>
+            <wp:docPr id="12" name="Picture 12"/>
+            <wp:cNvGraphicFramePr>
+              <a:graphicFrameLocks xmlns:a="http://schemas.openxmlformats.org/drawingml/2006/main" noChangeAspect="1"/>
+            </wp:cNvGraphicFramePr>
+            <a:graphic xmlns:a="http://schemas.openxmlformats.org/drawingml/2006/main">
+              <a:graphicData uri="http://schemas.openxmlformats.org/drawingml/2006/picture">
+                <pic:pic xmlns:pic="http://schemas.openxmlformats.org/drawingml/2006/picture">
+                  <pic:nvPicPr>
+                    <pic:cNvPr id="0" name="hadeed_3_legacy_attrs_cognitive.jpg"/>
+                    <pic:cNvPicPr/>
+                  </pic:nvPicPr>
+                  <pic:blipFill>
+                    <a:blip r:embed="rId22"/>
+                    <a:stretch>
+                      <a:fillRect/>
+                    </a:stretch>
+                  </pic:blipFill>
+                  <pic:spPr>
+                    <a:xfrm>
+                      <a:off x="0" y="0"/>
+                      <a:ext cx="5220000" cy="6960000"/>
+                    </a:xfrm>
+                    <a:prstGeom prst="rect">
+                      <a:avLst/>
+                    </a:prstGeom>
+                  </pic:spPr>
+                </pic:pic>
+              </a:graphicData>
+            </a:graphic>
+          </wp:inline>
+        </w:drawing>
+      </w:r>
+    </w:p>
+    <w:p>
+      <w:pPr>
+        <w:spacing w:after="160"/>
+        <w:jc w:val="center"/>
+      </w:pPr>
+      <w:r>
+        <w:rPr>
+          <w:i/>
+          <w:color w:val="5A5A5A"/>
+          <w:sz w:val="18"/>
+        </w:rPr>
+        <w:t>legacy_attrs.py: cyclomatic and cognitive complexity, summary</w:t>
       </w:r>
     </w:p>
     <w:p>
@@ -40509,7 +41112,7 @@
         <w:pStyle w:val="Heading1"/>
         <w:pageBreakBefore/>
       </w:pPr>
-      <w:bookmarkStart w:id="35" w:name="_Toc242517042"/>
+      <w:bookmarkStart w:id="35" w:name="_Toc242518839"/>
       <w:r>
         <w:lastRenderedPageBreak/>
         <w:t>Appendix B. Reproducing the Measurements</w:t>
@@ -40520,7 +41123,7 @@
       <w:r>
         <w:t xml:space="preserve">Scripts and raw tool outputs:  </w:t>
       </w:r>
-      <w:hyperlink r:id="rId14">
+      <w:hyperlink r:id="rId23">
         <w:r>
           <w:rPr>
             <w:color w:val="1C4E80"/>
@@ -40853,7 +41456,7 @@
       </w:r>
     </w:p>
     <w:sectPr>
-      <w:footerReference w:type="default" r:id="rId15"/>
+      <w:footerReference w:type="default" r:id="rId24"/>
       <w:pgSz w:w="11906" w:h="16838"/>
       <w:pgMar w:top="1134" w:right="1134" w:bottom="1077" w:left="1134" w:header="720" w:footer="720" w:gutter="0"/>
       <w:cols w:space="720"/>
@@ -41139,31 +41742,31 @@
       </w:rPr>
     </w:lvl>
   </w:abstractNum>
-  <w:num w:numId="1" w16cid:durableId="441844669">
+  <w:num w:numId="1" w16cid:durableId="1193879798">
     <w:abstractNumId w:val="8"/>
   </w:num>
-  <w:num w:numId="2" w16cid:durableId="782697254">
+  <w:num w:numId="2" w16cid:durableId="831288083">
     <w:abstractNumId w:val="6"/>
   </w:num>
-  <w:num w:numId="3" w16cid:durableId="1292634826">
+  <w:num w:numId="3" w16cid:durableId="723989417">
     <w:abstractNumId w:val="5"/>
   </w:num>
-  <w:num w:numId="4" w16cid:durableId="672803075">
+  <w:num w:numId="4" w16cid:durableId="973753846">
     <w:abstractNumId w:val="4"/>
   </w:num>
-  <w:num w:numId="5" w16cid:durableId="1465077495">
+  <w:num w:numId="5" w16cid:durableId="2019429925">
     <w:abstractNumId w:val="7"/>
   </w:num>
-  <w:num w:numId="6" w16cid:durableId="1851601565">
+  <w:num w:numId="6" w16cid:durableId="1681464371">
     <w:abstractNumId w:val="3"/>
   </w:num>
-  <w:num w:numId="7" w16cid:durableId="228540969">
+  <w:num w:numId="7" w16cid:durableId="1545022372">
     <w:abstractNumId w:val="2"/>
   </w:num>
-  <w:num w:numId="8" w16cid:durableId="1745955963">
+  <w:num w:numId="8" w16cid:durableId="2105302027">
     <w:abstractNumId w:val="1"/>
   </w:num>
-  <w:num w:numId="9" w16cid:durableId="652804565">
+  <w:num w:numId="9" w16cid:durableId="2086486086">
     <w:abstractNumId w:val="0"/>
   </w:num>
 </w:numbering>
@@ -52578,7 +53181,7 @@
     <w:autoRedefine/>
     <w:uiPriority w:val="39"/>
     <w:unhideWhenUsed/>
-    <w:rsid w:val="00D310FE"/>
+    <w:rsid w:val="00984E57"/>
     <w:pPr>
       <w:spacing w:after="100"/>
     </w:pPr>
@@ -52590,7 +53193,7 @@
     <w:autoRedefine/>
     <w:uiPriority w:val="39"/>
     <w:unhideWhenUsed/>
-    <w:rsid w:val="00D310FE"/>
+    <w:rsid w:val="00984E57"/>
     <w:pPr>
       <w:spacing w:after="100"/>
       <w:ind w:left="210"/>
@@ -52601,7 +53204,7 @@
     <w:basedOn w:val="DefaultParagraphFont"/>
     <w:uiPriority w:val="99"/>
     <w:unhideWhenUsed/>
-    <w:rsid w:val="00D310FE"/>
+    <w:rsid w:val="00984E57"/>
     <w:rPr>
       <w:color w:val="0000FF" w:themeColor="hyperlink"/>
       <w:u w:val="single"/>

</xml_diff>